<commit_message>
Minor changes to bootloader debug print. Changes and clean up to main applicaiton. Updates to UMTS
</commit_message>
<xml_diff>
--- a/Documents/User_Manual_Specification/SoftCore Spectrum Analyzer UMTS.docx
+++ b/Documents/User_Manual_Specification/SoftCore Spectrum Analyzer UMTS.docx
@@ -67,12 +67,6 @@
       <w:pPr>
         <w:jc w:val="center"/>
       </w:pPr>
-      <w:r>
-        <w:rPr>
-          <w:noProof/>
-        </w:rPr>
-        <w:t>xc</w:t>
-      </w:r>
       <w:r>
         <w:rPr>
           <w:noProof/>
@@ -220,7 +214,7 @@
           <w:r>
             <w:fldChar w:fldCharType="separate"/>
           </w:r>
-          <w:hyperlink w:anchor="_Toc224704976" w:history="1">
+          <w:hyperlink w:anchor="_Toc225065466" w:history="1">
             <w:r>
               <w:rPr>
                 <w:rStyle w:val="Hyperlink"/>
@@ -263,7 +257,7 @@
                 <w:noProof/>
                 <w:webHidden/>
               </w:rPr>
-              <w:instrText xml:space="preserve"> PAGEREF _Toc224704976 \h </w:instrText>
+              <w:instrText xml:space="preserve"> PAGEREF _Toc225065466 \h </w:instrText>
             </w:r>
             <w:r>
               <w:rPr>
@@ -308,7 +302,7 @@
               <w:szCs w:val="24"/>
             </w:rPr>
           </w:pPr>
-          <w:hyperlink w:anchor="_Toc224704977" w:history="1">
+          <w:hyperlink w:anchor="_Toc225065467" w:history="1">
             <w:r>
               <w:rPr>
                 <w:rStyle w:val="Hyperlink"/>
@@ -351,7 +345,7 @@
                 <w:noProof/>
                 <w:webHidden/>
               </w:rPr>
-              <w:instrText xml:space="preserve"> PAGEREF _Toc224704977 \h </w:instrText>
+              <w:instrText xml:space="preserve"> PAGEREF _Toc225065467 \h </w:instrText>
             </w:r>
             <w:r>
               <w:rPr>
@@ -396,7 +390,7 @@
               <w:szCs w:val="24"/>
             </w:rPr>
           </w:pPr>
-          <w:hyperlink w:anchor="_Toc224704978" w:history="1">
+          <w:hyperlink w:anchor="_Toc225065468" w:history="1">
             <w:r>
               <w:rPr>
                 <w:rStyle w:val="Hyperlink"/>
@@ -439,7 +433,7 @@
                 <w:noProof/>
                 <w:webHidden/>
               </w:rPr>
-              <w:instrText xml:space="preserve"> PAGEREF _Toc224704978 \h </w:instrText>
+              <w:instrText xml:space="preserve"> PAGEREF _Toc225065468 \h </w:instrText>
             </w:r>
             <w:r>
               <w:rPr>
@@ -484,7 +478,7 @@
               <w:szCs w:val="24"/>
             </w:rPr>
           </w:pPr>
-          <w:hyperlink w:anchor="_Toc224704979" w:history="1">
+          <w:hyperlink w:anchor="_Toc225065469" w:history="1">
             <w:r>
               <w:rPr>
                 <w:rStyle w:val="Hyperlink"/>
@@ -527,7 +521,7 @@
                 <w:noProof/>
                 <w:webHidden/>
               </w:rPr>
-              <w:instrText xml:space="preserve"> PAGEREF _Toc224704979 \h </w:instrText>
+              <w:instrText xml:space="preserve"> PAGEREF _Toc225065469 \h </w:instrText>
             </w:r>
             <w:r>
               <w:rPr>
@@ -572,7 +566,7 @@
               <w:szCs w:val="24"/>
             </w:rPr>
           </w:pPr>
-          <w:hyperlink w:anchor="_Toc224704980" w:history="1">
+          <w:hyperlink w:anchor="_Toc225065470" w:history="1">
             <w:r>
               <w:rPr>
                 <w:rStyle w:val="Hyperlink"/>
@@ -615,7 +609,7 @@
                 <w:noProof/>
                 <w:webHidden/>
               </w:rPr>
-              <w:instrText xml:space="preserve"> PAGEREF _Toc224704980 \h </w:instrText>
+              <w:instrText xml:space="preserve"> PAGEREF _Toc225065470 \h </w:instrText>
             </w:r>
             <w:r>
               <w:rPr>
@@ -660,7 +654,7 @@
               <w:szCs w:val="24"/>
             </w:rPr>
           </w:pPr>
-          <w:hyperlink w:anchor="_Toc224704981" w:history="1">
+          <w:hyperlink w:anchor="_Toc225065471" w:history="1">
             <w:r>
               <w:rPr>
                 <w:rStyle w:val="Hyperlink"/>
@@ -703,7 +697,7 @@
                 <w:noProof/>
                 <w:webHidden/>
               </w:rPr>
-              <w:instrText xml:space="preserve"> PAGEREF _Toc224704981 \h </w:instrText>
+              <w:instrText xml:space="preserve"> PAGEREF _Toc225065471 \h </w:instrText>
             </w:r>
             <w:r>
               <w:rPr>
@@ -748,7 +742,7 @@
               <w:szCs w:val="24"/>
             </w:rPr>
           </w:pPr>
-          <w:hyperlink w:anchor="_Toc224704982" w:history="1">
+          <w:hyperlink w:anchor="_Toc225065472" w:history="1">
             <w:r>
               <w:rPr>
                 <w:rStyle w:val="Hyperlink"/>
@@ -791,7 +785,7 @@
                 <w:noProof/>
                 <w:webHidden/>
               </w:rPr>
-              <w:instrText xml:space="preserve"> PAGEREF _Toc224704982 \h </w:instrText>
+              <w:instrText xml:space="preserve"> PAGEREF _Toc225065472 \h </w:instrText>
             </w:r>
             <w:r>
               <w:rPr>
@@ -836,7 +830,7 @@
               <w:szCs w:val="24"/>
             </w:rPr>
           </w:pPr>
-          <w:hyperlink w:anchor="_Toc224704983" w:history="1">
+          <w:hyperlink w:anchor="_Toc225065473" w:history="1">
             <w:r>
               <w:rPr>
                 <w:rStyle w:val="Hyperlink"/>
@@ -879,7 +873,7 @@
                 <w:noProof/>
                 <w:webHidden/>
               </w:rPr>
-              <w:instrText xml:space="preserve"> PAGEREF _Toc224704983 \h </w:instrText>
+              <w:instrText xml:space="preserve"> PAGEREF _Toc225065473 \h </w:instrText>
             </w:r>
             <w:r>
               <w:rPr>
@@ -924,7 +918,7 @@
               <w:szCs w:val="24"/>
             </w:rPr>
           </w:pPr>
-          <w:hyperlink w:anchor="_Toc224704984" w:history="1">
+          <w:hyperlink w:anchor="_Toc225065474" w:history="1">
             <w:r>
               <w:rPr>
                 <w:rStyle w:val="Hyperlink"/>
@@ -967,7 +961,7 @@
                 <w:noProof/>
                 <w:webHidden/>
               </w:rPr>
-              <w:instrText xml:space="preserve"> PAGEREF _Toc224704984 \h </w:instrText>
+              <w:instrText xml:space="preserve"> PAGEREF _Toc225065474 \h </w:instrText>
             </w:r>
             <w:r>
               <w:rPr>
@@ -1012,7 +1006,7 @@
               <w:szCs w:val="24"/>
             </w:rPr>
           </w:pPr>
-          <w:hyperlink w:anchor="_Toc224704985" w:history="1">
+          <w:hyperlink w:anchor="_Toc225065475" w:history="1">
             <w:r>
               <w:rPr>
                 <w:rStyle w:val="Hyperlink"/>
@@ -1055,7 +1049,7 @@
                 <w:noProof/>
                 <w:webHidden/>
               </w:rPr>
-              <w:instrText xml:space="preserve"> PAGEREF _Toc224704985 \h </w:instrText>
+              <w:instrText xml:space="preserve"> PAGEREF _Toc225065475 \h </w:instrText>
             </w:r>
             <w:r>
               <w:rPr>
@@ -1100,7 +1094,7 @@
               <w:szCs w:val="24"/>
             </w:rPr>
           </w:pPr>
-          <w:hyperlink w:anchor="_Toc224704986" w:history="1">
+          <w:hyperlink w:anchor="_Toc225065476" w:history="1">
             <w:r>
               <w:rPr>
                 <w:rStyle w:val="Hyperlink"/>
@@ -1143,7 +1137,7 @@
                 <w:noProof/>
                 <w:webHidden/>
               </w:rPr>
-              <w:instrText xml:space="preserve"> PAGEREF _Toc224704986 \h </w:instrText>
+              <w:instrText xml:space="preserve"> PAGEREF _Toc225065476 \h </w:instrText>
             </w:r>
             <w:r>
               <w:rPr>
@@ -1188,7 +1182,7 @@
               <w:szCs w:val="24"/>
             </w:rPr>
           </w:pPr>
-          <w:hyperlink w:anchor="_Toc224704987" w:history="1">
+          <w:hyperlink w:anchor="_Toc225065477" w:history="1">
             <w:r>
               <w:rPr>
                 <w:rStyle w:val="Hyperlink"/>
@@ -1231,7 +1225,7 @@
                 <w:noProof/>
                 <w:webHidden/>
               </w:rPr>
-              <w:instrText xml:space="preserve"> PAGEREF _Toc224704987 \h </w:instrText>
+              <w:instrText xml:space="preserve"> PAGEREF _Toc225065477 \h </w:instrText>
             </w:r>
             <w:r>
               <w:rPr>
@@ -1276,7 +1270,7 @@
               <w:szCs w:val="24"/>
             </w:rPr>
           </w:pPr>
-          <w:hyperlink w:anchor="_Toc224704988" w:history="1">
+          <w:hyperlink w:anchor="_Toc225065478" w:history="1">
             <w:r>
               <w:rPr>
                 <w:rStyle w:val="Hyperlink"/>
@@ -1319,7 +1313,7 @@
                 <w:noProof/>
                 <w:webHidden/>
               </w:rPr>
-              <w:instrText xml:space="preserve"> PAGEREF _Toc224704988 \h </w:instrText>
+              <w:instrText xml:space="preserve"> PAGEREF _Toc225065478 \h </w:instrText>
             </w:r>
             <w:r>
               <w:rPr>
@@ -1364,7 +1358,7 @@
               <w:szCs w:val="24"/>
             </w:rPr>
           </w:pPr>
-          <w:hyperlink w:anchor="_Toc224704989" w:history="1">
+          <w:hyperlink w:anchor="_Toc225065479" w:history="1">
             <w:r>
               <w:rPr>
                 <w:rStyle w:val="Hyperlink"/>
@@ -1407,7 +1401,7 @@
                 <w:noProof/>
                 <w:webHidden/>
               </w:rPr>
-              <w:instrText xml:space="preserve"> PAGEREF _Toc224704989 \h </w:instrText>
+              <w:instrText xml:space="preserve"> PAGEREF _Toc225065479 \h </w:instrText>
             </w:r>
             <w:r>
               <w:rPr>
@@ -1452,7 +1446,7 @@
               <w:szCs w:val="24"/>
             </w:rPr>
           </w:pPr>
-          <w:hyperlink w:anchor="_Toc224704990" w:history="1">
+          <w:hyperlink w:anchor="_Toc225065480" w:history="1">
             <w:r>
               <w:rPr>
                 <w:rStyle w:val="Hyperlink"/>
@@ -1495,7 +1489,7 @@
                 <w:noProof/>
                 <w:webHidden/>
               </w:rPr>
-              <w:instrText xml:space="preserve"> PAGEREF _Toc224704990 \h </w:instrText>
+              <w:instrText xml:space="preserve"> PAGEREF _Toc225065480 \h </w:instrText>
             </w:r>
             <w:r>
               <w:rPr>
@@ -1540,7 +1534,7 @@
               <w:szCs w:val="24"/>
             </w:rPr>
           </w:pPr>
-          <w:hyperlink w:anchor="_Toc224704991" w:history="1">
+          <w:hyperlink w:anchor="_Toc225065481" w:history="1">
             <w:r>
               <w:rPr>
                 <w:rStyle w:val="Hyperlink"/>
@@ -1583,7 +1577,7 @@
                 <w:noProof/>
                 <w:webHidden/>
               </w:rPr>
-              <w:instrText xml:space="preserve"> PAGEREF _Toc224704991 \h </w:instrText>
+              <w:instrText xml:space="preserve"> PAGEREF _Toc225065481 \h </w:instrText>
             </w:r>
             <w:r>
               <w:rPr>
@@ -1628,7 +1622,7 @@
               <w:szCs w:val="24"/>
             </w:rPr>
           </w:pPr>
-          <w:hyperlink w:anchor="_Toc224704992" w:history="1">
+          <w:hyperlink w:anchor="_Toc225065482" w:history="1">
             <w:r>
               <w:rPr>
                 <w:rStyle w:val="Hyperlink"/>
@@ -1671,7 +1665,7 @@
                 <w:noProof/>
                 <w:webHidden/>
               </w:rPr>
-              <w:instrText xml:space="preserve"> PAGEREF _Toc224704992 \h </w:instrText>
+              <w:instrText xml:space="preserve"> PAGEREF _Toc225065482 \h </w:instrText>
             </w:r>
             <w:r>
               <w:rPr>
@@ -1716,7 +1710,7 @@
               <w:szCs w:val="24"/>
             </w:rPr>
           </w:pPr>
-          <w:hyperlink w:anchor="_Toc224704993" w:history="1">
+          <w:hyperlink w:anchor="_Toc225065483" w:history="1">
             <w:r>
               <w:rPr>
                 <w:rStyle w:val="Hyperlink"/>
@@ -1759,7 +1753,7 @@
                 <w:noProof/>
                 <w:webHidden/>
               </w:rPr>
-              <w:instrText xml:space="preserve"> PAGEREF _Toc224704993 \h </w:instrText>
+              <w:instrText xml:space="preserve"> PAGEREF _Toc225065483 \h </w:instrText>
             </w:r>
             <w:r>
               <w:rPr>
@@ -1804,7 +1798,7 @@
               <w:szCs w:val="24"/>
             </w:rPr>
           </w:pPr>
-          <w:hyperlink w:anchor="_Toc224704994" w:history="1">
+          <w:hyperlink w:anchor="_Toc225065484" w:history="1">
             <w:r>
               <w:rPr>
                 <w:rStyle w:val="Hyperlink"/>
@@ -1847,7 +1841,7 @@
                 <w:noProof/>
                 <w:webHidden/>
               </w:rPr>
-              <w:instrText xml:space="preserve"> PAGEREF _Toc224704994 \h </w:instrText>
+              <w:instrText xml:space="preserve"> PAGEREF _Toc225065484 \h </w:instrText>
             </w:r>
             <w:r>
               <w:rPr>
@@ -1892,7 +1886,7 @@
               <w:szCs w:val="24"/>
             </w:rPr>
           </w:pPr>
-          <w:hyperlink w:anchor="_Toc224704995" w:history="1">
+          <w:hyperlink w:anchor="_Toc225065485" w:history="1">
             <w:r>
               <w:rPr>
                 <w:rStyle w:val="Hyperlink"/>
@@ -1935,7 +1929,7 @@
                 <w:noProof/>
                 <w:webHidden/>
               </w:rPr>
-              <w:instrText xml:space="preserve"> PAGEREF _Toc224704995 \h </w:instrText>
+              <w:instrText xml:space="preserve"> PAGEREF _Toc225065485 \h </w:instrText>
             </w:r>
             <w:r>
               <w:rPr>
@@ -1980,7 +1974,7 @@
               <w:szCs w:val="24"/>
             </w:rPr>
           </w:pPr>
-          <w:hyperlink w:anchor="_Toc224704996" w:history="1">
+          <w:hyperlink w:anchor="_Toc225065486" w:history="1">
             <w:r>
               <w:rPr>
                 <w:rStyle w:val="Hyperlink"/>
@@ -2023,7 +2017,7 @@
                 <w:noProof/>
                 <w:webHidden/>
               </w:rPr>
-              <w:instrText xml:space="preserve"> PAGEREF _Toc224704996 \h </w:instrText>
+              <w:instrText xml:space="preserve"> PAGEREF _Toc225065486 \h </w:instrText>
             </w:r>
             <w:r>
               <w:rPr>
@@ -2068,7 +2062,7 @@
               <w:szCs w:val="24"/>
             </w:rPr>
           </w:pPr>
-          <w:hyperlink w:anchor="_Toc224704997" w:history="1">
+          <w:hyperlink w:anchor="_Toc225065487" w:history="1">
             <w:r>
               <w:rPr>
                 <w:rStyle w:val="Hyperlink"/>
@@ -2111,7 +2105,7 @@
                 <w:noProof/>
                 <w:webHidden/>
               </w:rPr>
-              <w:instrText xml:space="preserve"> PAGEREF _Toc224704997 \h </w:instrText>
+              <w:instrText xml:space="preserve"> PAGEREF _Toc225065487 \h </w:instrText>
             </w:r>
             <w:r>
               <w:rPr>
@@ -2156,7 +2150,7 @@
               <w:szCs w:val="24"/>
             </w:rPr>
           </w:pPr>
-          <w:hyperlink w:anchor="_Toc224704998" w:history="1">
+          <w:hyperlink w:anchor="_Toc225065488" w:history="1">
             <w:r>
               <w:rPr>
                 <w:rStyle w:val="Hyperlink"/>
@@ -2199,7 +2193,7 @@
                 <w:noProof/>
                 <w:webHidden/>
               </w:rPr>
-              <w:instrText xml:space="preserve"> PAGEREF _Toc224704998 \h </w:instrText>
+              <w:instrText xml:space="preserve"> PAGEREF _Toc225065488 \h </w:instrText>
             </w:r>
             <w:r>
               <w:rPr>
@@ -2244,7 +2238,7 @@
               <w:szCs w:val="24"/>
             </w:rPr>
           </w:pPr>
-          <w:hyperlink w:anchor="_Toc224704999" w:history="1">
+          <w:hyperlink w:anchor="_Toc225065489" w:history="1">
             <w:r>
               <w:rPr>
                 <w:rStyle w:val="Hyperlink"/>
@@ -2287,7 +2281,7 @@
                 <w:noProof/>
                 <w:webHidden/>
               </w:rPr>
-              <w:instrText xml:space="preserve"> PAGEREF _Toc224704999 \h </w:instrText>
+              <w:instrText xml:space="preserve"> PAGEREF _Toc225065489 \h </w:instrText>
             </w:r>
             <w:r>
               <w:rPr>
@@ -2332,7 +2326,7 @@
               <w:szCs w:val="24"/>
             </w:rPr>
           </w:pPr>
-          <w:hyperlink w:anchor="_Toc224705000" w:history="1">
+          <w:hyperlink w:anchor="_Toc225065490" w:history="1">
             <w:r>
               <w:rPr>
                 <w:rStyle w:val="Hyperlink"/>
@@ -2375,7 +2369,7 @@
                 <w:noProof/>
                 <w:webHidden/>
               </w:rPr>
-              <w:instrText xml:space="preserve"> PAGEREF _Toc224705000 \h </w:instrText>
+              <w:instrText xml:space="preserve"> PAGEREF _Toc225065490 \h </w:instrText>
             </w:r>
             <w:r>
               <w:rPr>
@@ -2395,7 +2389,7 @@
                 <w:noProof/>
                 <w:webHidden/>
               </w:rPr>
-              <w:t>17</w:t>
+              <w:t>18</w:t>
             </w:r>
             <w:r>
               <w:rPr>
@@ -2420,7 +2414,7 @@
               <w:szCs w:val="24"/>
             </w:rPr>
           </w:pPr>
-          <w:hyperlink w:anchor="_Toc224705001" w:history="1">
+          <w:hyperlink w:anchor="_Toc225065491" w:history="1">
             <w:r>
               <w:rPr>
                 <w:rStyle w:val="Hyperlink"/>
@@ -2463,7 +2457,7 @@
                 <w:noProof/>
                 <w:webHidden/>
               </w:rPr>
-              <w:instrText xml:space="preserve"> PAGEREF _Toc224705001 \h </w:instrText>
+              <w:instrText xml:space="preserve"> PAGEREF _Toc225065491 \h </w:instrText>
             </w:r>
             <w:r>
               <w:rPr>
@@ -2483,7 +2477,7 @@
                 <w:noProof/>
                 <w:webHidden/>
               </w:rPr>
-              <w:t>17</w:t>
+              <w:t>18</w:t>
             </w:r>
             <w:r>
               <w:rPr>
@@ -2508,7 +2502,7 @@
               <w:szCs w:val="24"/>
             </w:rPr>
           </w:pPr>
-          <w:hyperlink w:anchor="_Toc224705002" w:history="1">
+          <w:hyperlink w:anchor="_Toc225065492" w:history="1">
             <w:r>
               <w:rPr>
                 <w:rStyle w:val="Hyperlink"/>
@@ -2551,7 +2545,7 @@
                 <w:noProof/>
                 <w:webHidden/>
               </w:rPr>
-              <w:instrText xml:space="preserve"> PAGEREF _Toc224705002 \h </w:instrText>
+              <w:instrText xml:space="preserve"> PAGEREF _Toc225065492 \h </w:instrText>
             </w:r>
             <w:r>
               <w:rPr>
@@ -2596,7 +2590,7 @@
               <w:szCs w:val="24"/>
             </w:rPr>
           </w:pPr>
-          <w:hyperlink w:anchor="_Toc224705003" w:history="1">
+          <w:hyperlink w:anchor="_Toc225065493" w:history="1">
             <w:r>
               <w:rPr>
                 <w:rStyle w:val="Hyperlink"/>
@@ -2639,7 +2633,7 @@
                 <w:noProof/>
                 <w:webHidden/>
               </w:rPr>
-              <w:instrText xml:space="preserve"> PAGEREF _Toc224705003 \h </w:instrText>
+              <w:instrText xml:space="preserve"> PAGEREF _Toc225065493 \h </w:instrText>
             </w:r>
             <w:r>
               <w:rPr>
@@ -2684,7 +2678,7 @@
               <w:szCs w:val="24"/>
             </w:rPr>
           </w:pPr>
-          <w:hyperlink w:anchor="_Toc224705004" w:history="1">
+          <w:hyperlink w:anchor="_Toc225065494" w:history="1">
             <w:r>
               <w:rPr>
                 <w:rStyle w:val="Hyperlink"/>
@@ -2727,7 +2721,7 @@
                 <w:noProof/>
                 <w:webHidden/>
               </w:rPr>
-              <w:instrText xml:space="preserve"> PAGEREF _Toc224705004 \h </w:instrText>
+              <w:instrText xml:space="preserve"> PAGEREF _Toc225065494 \h </w:instrText>
             </w:r>
             <w:r>
               <w:rPr>
@@ -2772,7 +2766,7 @@
               <w:szCs w:val="24"/>
             </w:rPr>
           </w:pPr>
-          <w:hyperlink w:anchor="_Toc224705005" w:history="1">
+          <w:hyperlink w:anchor="_Toc225065495" w:history="1">
             <w:r>
               <w:rPr>
                 <w:rStyle w:val="Hyperlink"/>
@@ -2815,7 +2809,7 @@
                 <w:noProof/>
                 <w:webHidden/>
               </w:rPr>
-              <w:instrText xml:space="preserve"> PAGEREF _Toc224705005 \h </w:instrText>
+              <w:instrText xml:space="preserve"> PAGEREF _Toc225065495 \h </w:instrText>
             </w:r>
             <w:r>
               <w:rPr>
@@ -2860,7 +2854,7 @@
               <w:szCs w:val="24"/>
             </w:rPr>
           </w:pPr>
-          <w:hyperlink w:anchor="_Toc224705006" w:history="1">
+          <w:hyperlink w:anchor="_Toc225065496" w:history="1">
             <w:r>
               <w:rPr>
                 <w:rStyle w:val="Hyperlink"/>
@@ -2903,7 +2897,7 @@
                 <w:noProof/>
                 <w:webHidden/>
               </w:rPr>
-              <w:instrText xml:space="preserve"> PAGEREF _Toc224705006 \h </w:instrText>
+              <w:instrText xml:space="preserve"> PAGEREF _Toc225065496 \h </w:instrText>
             </w:r>
             <w:r>
               <w:rPr>
@@ -2948,7 +2942,7 @@
               <w:szCs w:val="24"/>
             </w:rPr>
           </w:pPr>
-          <w:hyperlink w:anchor="_Toc224705007" w:history="1">
+          <w:hyperlink w:anchor="_Toc225065497" w:history="1">
             <w:r>
               <w:rPr>
                 <w:rStyle w:val="Hyperlink"/>
@@ -2991,7 +2985,7 @@
                 <w:noProof/>
                 <w:webHidden/>
               </w:rPr>
-              <w:instrText xml:space="preserve"> PAGEREF _Toc224705007 \h </w:instrText>
+              <w:instrText xml:space="preserve"> PAGEREF _Toc225065497 \h </w:instrText>
             </w:r>
             <w:r>
               <w:rPr>
@@ -3036,7 +3030,7 @@
               <w:szCs w:val="24"/>
             </w:rPr>
           </w:pPr>
-          <w:hyperlink w:anchor="_Toc224705008" w:history="1">
+          <w:hyperlink w:anchor="_Toc225065498" w:history="1">
             <w:r>
               <w:rPr>
                 <w:rStyle w:val="Hyperlink"/>
@@ -3079,7 +3073,7 @@
                 <w:noProof/>
                 <w:webHidden/>
               </w:rPr>
-              <w:instrText xml:space="preserve"> PAGEREF _Toc224705008 \h </w:instrText>
+              <w:instrText xml:space="preserve"> PAGEREF _Toc225065498 \h </w:instrText>
             </w:r>
             <w:r>
               <w:rPr>
@@ -3124,7 +3118,7 @@
               <w:szCs w:val="24"/>
             </w:rPr>
           </w:pPr>
-          <w:hyperlink w:anchor="_Toc224705009" w:history="1">
+          <w:hyperlink w:anchor="_Toc225065499" w:history="1">
             <w:r>
               <w:rPr>
                 <w:rStyle w:val="Hyperlink"/>
@@ -3167,7 +3161,7 @@
                 <w:noProof/>
                 <w:webHidden/>
               </w:rPr>
-              <w:instrText xml:space="preserve"> PAGEREF _Toc224705009 \h </w:instrText>
+              <w:instrText xml:space="preserve"> PAGEREF _Toc225065499 \h </w:instrText>
             </w:r>
             <w:r>
               <w:rPr>
@@ -3212,7 +3206,7 @@
               <w:szCs w:val="24"/>
             </w:rPr>
           </w:pPr>
-          <w:hyperlink w:anchor="_Toc224705010" w:history="1">
+          <w:hyperlink w:anchor="_Toc225065500" w:history="1">
             <w:r>
               <w:rPr>
                 <w:rStyle w:val="Hyperlink"/>
@@ -3255,7 +3249,7 @@
                 <w:noProof/>
                 <w:webHidden/>
               </w:rPr>
-              <w:instrText xml:space="preserve"> PAGEREF _Toc224705010 \h </w:instrText>
+              <w:instrText xml:space="preserve"> PAGEREF _Toc225065500 \h </w:instrText>
             </w:r>
             <w:r>
               <w:rPr>
@@ -3300,7 +3294,7 @@
               <w:szCs w:val="24"/>
             </w:rPr>
           </w:pPr>
-          <w:hyperlink w:anchor="_Toc224705011" w:history="1">
+          <w:hyperlink w:anchor="_Toc225065501" w:history="1">
             <w:r>
               <w:rPr>
                 <w:rStyle w:val="Hyperlink"/>
@@ -3343,7 +3337,7 @@
                 <w:noProof/>
                 <w:webHidden/>
               </w:rPr>
-              <w:instrText xml:space="preserve"> PAGEREF _Toc224705011 \h </w:instrText>
+              <w:instrText xml:space="preserve"> PAGEREF _Toc225065501 \h </w:instrText>
             </w:r>
             <w:r>
               <w:rPr>
@@ -3763,7 +3757,7 @@
         <w:pStyle w:val="Heading1"/>
       </w:pPr>
       <w:bookmarkStart w:id="1" w:name="_Hlk199332212"/>
-      <w:bookmarkStart w:id="2" w:name="_Toc224704976"/>
+      <w:bookmarkStart w:id="2" w:name="_Toc225065466"/>
       <w:r>
         <w:lastRenderedPageBreak/>
         <w:t>INTRODUCTION</w:t>
@@ -3777,7 +3771,7 @@
       <w:pPr>
         <w:pStyle w:val="Heading2"/>
       </w:pPr>
-      <w:bookmarkStart w:id="3" w:name="_Toc224704977"/>
+      <w:bookmarkStart w:id="3" w:name="_Toc225065467"/>
       <w:r>
         <w:t xml:space="preserve">THE </w:t>
       </w:r>
@@ -3803,243 +3797,279 @@
         <w:t>µ</w:t>
       </w:r>
       <w:r>
+        <w:t xml:space="preserve">C) </w:t>
+      </w:r>
+      <w:r>
+        <w:t xml:space="preserve">architecture provides an excellent balance of performance, cost, and development complexity.  It is therefore natural to ask an important engineering question: where does a pure </w:t>
+      </w:r>
+      <w:r>
+        <w:t>Processor Logic (</w:t>
+      </w:r>
+      <w:r>
+        <w:t>PL</w:t>
+      </w:r>
+      <w:r>
+        <w:t>)</w:t>
+      </w:r>
+      <w:r>
+        <w:t xml:space="preserve"> based </w:t>
+      </w:r>
+      <w:r>
+        <w:t xml:space="preserve">FPGA system fit into this landscape?  </w:t>
+      </w:r>
+    </w:p>
+    <w:p>
+      <w:pPr>
+        <w:jc w:val="both"/>
+        <w:rPr>
+          <w:rFonts w:ascii="Times New Roman" w:hAnsi="Times New Roman"/>
+        </w:rPr>
+      </w:pPr>
+    </w:p>
+    <w:p>
+      <w:pPr>
+        <w:jc w:val="both"/>
+      </w:pPr>
+      <w:r>
+        <w:t>In comparison t</w:t>
+      </w:r>
+      <w:r>
+        <w:t xml:space="preserve">here is nothing </w:t>
+      </w:r>
+      <w:r>
+        <w:t>eas</w:t>
+      </w:r>
+      <w:r>
+        <w:t xml:space="preserve">y, </w:t>
+      </w:r>
+      <w:r>
+        <w:t>cheap</w:t>
+      </w:r>
+      <w:r>
+        <w:t xml:space="preserve"> or quick </w:t>
+      </w:r>
+      <w:r>
+        <w:t>about</w:t>
+      </w:r>
+      <w:r>
+        <w:t xml:space="preserve"> an FPGA</w:t>
+      </w:r>
+      <w:r>
+        <w:t>.  The FPGA simply cannot compete in those categories, but for everything else it excels</w:t>
+      </w:r>
+      <w:r>
+        <w:t xml:space="preserve">.  </w:t>
+      </w:r>
+      <w:r>
+        <w:t>T</w:t>
+      </w:r>
+      <w:r>
+        <w:t xml:space="preserve">he challenge explored in this project is not a feature-for-feature comparison between an FPGA and a </w:t>
+      </w:r>
+      <w:r>
+        <w:t>µ</w:t>
+      </w:r>
+      <w:r>
+        <w:t>C.  Instead, the goal is to explore the practical capabilities of a pure PL FPGA platform by implementing two distinct design projects and observing how such a system compares in practice to what might traditionally be implemented on an ARM Cortex M4</w:t>
+      </w:r>
+      <w:r>
+        <w:t>/M7</w:t>
+      </w:r>
+      <w:r>
+        <w:t xml:space="preserve"> class device or higher.</w:t>
+      </w:r>
+    </w:p>
+    <w:p>
+      <w:pPr>
+        <w:jc w:val="both"/>
+      </w:pPr>
+    </w:p>
+    <w:p>
+      <w:pPr>
+        <w:jc w:val="both"/>
+      </w:pPr>
+      <w:r>
+        <w:t xml:space="preserve">The first phase of this exploration focuses on constructing an FPGA-based system that resembles the functional architecture commonly found in a </w:t>
+      </w:r>
+      <w:r>
+        <w:t>µ</w:t>
+      </w:r>
+      <w:r>
+        <w:t xml:space="preserve">C environment.  </w:t>
+      </w:r>
+      <w:r>
+        <w:t xml:space="preserve"> Within the PL</w:t>
+      </w:r>
+      <w:r>
+        <w:t>,</w:t>
+      </w:r>
+      <w:r>
+        <w:t xml:space="preserve"> a subset of needed peripherals </w:t>
+      </w:r>
+      <w:proofErr w:type="gramStart"/>
+      <w:r>
+        <w:t>are</w:t>
+      </w:r>
+      <w:proofErr w:type="gramEnd"/>
+      <w:r>
+        <w:t xml:space="preserve"> implemented which include: </w:t>
+      </w:r>
+      <w:r>
+        <w:t>UART</w:t>
+      </w:r>
+      <w:r>
+        <w:t xml:space="preserve">, </w:t>
+      </w:r>
+      <w:r>
+        <w:t xml:space="preserve">SPI, DDR, </w:t>
+      </w:r>
+      <w:r>
+        <w:t>T</w:t>
+      </w:r>
+      <w:r>
+        <w:t xml:space="preserve">imers, </w:t>
+      </w:r>
+      <w:proofErr w:type="spellStart"/>
+      <w:r>
+        <w:t>PWM</w:t>
+      </w:r>
+      <w:proofErr w:type="spellEnd"/>
+      <w:r>
+        <w:t xml:space="preserve">, </w:t>
+      </w:r>
+      <w:r>
+        <w:t xml:space="preserve">Interrupt Controller, </w:t>
+      </w:r>
+      <w:proofErr w:type="spellStart"/>
+      <w:r>
+        <w:t>FPU</w:t>
+      </w:r>
+      <w:proofErr w:type="spellEnd"/>
+      <w:r>
+        <w:t xml:space="preserve">, Cache memory </w:t>
+      </w:r>
+      <w:r>
+        <w:t>and other system services required to support a complete embedded application.</w:t>
+      </w:r>
+      <w:r>
+        <w:t xml:space="preserve">  </w:t>
+      </w:r>
+      <w:r>
+        <w:t xml:space="preserve">The resulting system demonstrates that the fundamental building blocks normally associated with a </w:t>
+      </w:r>
+      <w:r>
+        <w:t>µ</w:t>
+      </w:r>
+      <w:r>
+        <w:t xml:space="preserve">C </w:t>
+      </w:r>
+      <w:r>
+        <w:t xml:space="preserve">can be </w:t>
+      </w:r>
+      <w:r>
+        <w:t>tailored specifically to create the device need</w:t>
+      </w:r>
+      <w:r>
+        <w:t>ed</w:t>
+      </w:r>
+      <w:r>
+        <w:t xml:space="preserve">. </w:t>
+      </w:r>
+      <w:r>
+        <w:t xml:space="preserve">  That said, incorporated into </w:t>
+      </w:r>
+      <w:r>
+        <w:t xml:space="preserve">this first </w:t>
+      </w:r>
+      <w:r>
+        <w:t>phase</w:t>
+      </w:r>
+      <w:r>
+        <w:t xml:space="preserve"> </w:t>
+      </w:r>
+      <w:r>
+        <w:t xml:space="preserve">a </w:t>
+      </w:r>
+      <w:r>
+        <w:t xml:space="preserve">preview of what lies ahead through the inclusion of </w:t>
+      </w:r>
+      <w:r>
+        <w:t xml:space="preserve">two </w:t>
+      </w:r>
+      <w:r>
+        <w:t>custom RTL-based</w:t>
+      </w:r>
+      <w:r>
+        <w:t xml:space="preserve"> IP</w:t>
+      </w:r>
+      <w:r>
+        <w:t xml:space="preserve"> blocks</w:t>
+      </w:r>
+      <w:r>
+        <w:t xml:space="preserve"> (aka </w:t>
+      </w:r>
+      <w:r>
+        <w:t>m</w:t>
+      </w:r>
+      <w:r>
+        <w:t>odules)</w:t>
+      </w:r>
+      <w:r>
+        <w:t xml:space="preserve"> – </w:t>
+      </w:r>
+      <w:r>
+        <w:t xml:space="preserve">something </w:t>
+      </w:r>
+      <w:r>
+        <w:t xml:space="preserve">you cannot do within a </w:t>
+      </w:r>
+      <w:r>
+        <w:t>µ</w:t>
+      </w:r>
+      <w:r>
         <w:t>C</w:t>
       </w:r>
       <w:r>
-        <w:t xml:space="preserve">) </w:t>
-      </w:r>
-      <w:r>
-        <w:t xml:space="preserve">architecture provides an excellent balance of performance, cost, and development complexity.  It is therefore natural to ask an important engineering question: where does a pure </w:t>
-      </w:r>
-      <w:r>
-        <w:t>Processor Logic (</w:t>
-      </w:r>
-      <w:r>
-        <w:t>PL</w:t>
-      </w:r>
-      <w:r>
-        <w:t>)</w:t>
-      </w:r>
-      <w:r>
-        <w:t xml:space="preserve"> based </w:t>
-      </w:r>
-      <w:r>
-        <w:t xml:space="preserve">FPGA system fit into this landscape?  </w:t>
-      </w:r>
-    </w:p>
-    <w:p>
-      <w:pPr>
-        <w:jc w:val="both"/>
-        <w:rPr>
-          <w:rFonts w:ascii="Times New Roman" w:hAnsi="Times New Roman"/>
-        </w:rPr>
-      </w:pPr>
-    </w:p>
-    <w:p>
-      <w:pPr>
-        <w:jc w:val="both"/>
-      </w:pPr>
-      <w:r>
-        <w:t>In comparison t</w:t>
-      </w:r>
-      <w:r>
-        <w:t xml:space="preserve">here is nothing </w:t>
-      </w:r>
-      <w:r>
-        <w:t>eas</w:t>
-      </w:r>
-      <w:r>
-        <w:t xml:space="preserve">y, </w:t>
-      </w:r>
-      <w:r>
-        <w:t>cheap</w:t>
-      </w:r>
-      <w:r>
-        <w:t xml:space="preserve"> or quick </w:t>
-      </w:r>
-      <w:r>
-        <w:t>about</w:t>
-      </w:r>
-      <w:r>
-        <w:t xml:space="preserve"> an FPGA</w:t>
-      </w:r>
-      <w:r>
-        <w:t>.  The FPGA simply cannot compete in those categories, but for everything else it excels</w:t>
-      </w:r>
-      <w:r>
-        <w:t xml:space="preserve">.  </w:t>
-      </w:r>
-      <w:r>
-        <w:t>T</w:t>
-      </w:r>
-      <w:r>
-        <w:t xml:space="preserve">he challenge explored in this project is not a feature-for-feature comparison between an FPGA and a </w:t>
-      </w:r>
-      <w:r>
-        <w:t>µ</w:t>
-      </w:r>
-      <w:r>
-        <w:t>C.  Instead, the goal is to explore the practical capabilities of a pure PL FPGA platform by implementing two distinct design projects and observing how such a system compares in practice to what might traditionally be implemented on an ARM Cortex M4</w:t>
-      </w:r>
-      <w:r>
-        <w:t>/M7</w:t>
-      </w:r>
-      <w:r>
-        <w:t xml:space="preserve"> class device or higher.</w:t>
-      </w:r>
-    </w:p>
-    <w:p>
-      <w:pPr>
-        <w:jc w:val="both"/>
-      </w:pPr>
-    </w:p>
-    <w:p>
-      <w:pPr>
-        <w:jc w:val="both"/>
-      </w:pPr>
-      <w:r>
-        <w:t xml:space="preserve">The first phase of this exploration focuses on constructing an FPGA-based system that resembles the functional architecture commonly found in a </w:t>
-      </w:r>
-      <w:r>
-        <w:t>µ</w:t>
-      </w:r>
-      <w:r>
-        <w:t xml:space="preserve">C environment.  </w:t>
-      </w:r>
-      <w:r>
-        <w:t xml:space="preserve"> Within the PL</w:t>
+        <w:t xml:space="preserve"> along with a few other FPGA differentiators.  </w:t>
+      </w:r>
+    </w:p>
+    <w:p>
+      <w:pPr>
+        <w:jc w:val="both"/>
+      </w:pPr>
+    </w:p>
+    <w:p>
+      <w:pPr>
+        <w:pStyle w:val="Heading2"/>
+        <w:jc w:val="both"/>
+      </w:pPr>
+      <w:bookmarkStart w:id="4" w:name="_Toc225065468"/>
+      <w:r>
+        <w:t>PHASE 1 / PHASE 2</w:t>
+      </w:r>
+      <w:r>
+        <w:t>:</w:t>
+      </w:r>
+      <w:bookmarkEnd w:id="4"/>
+    </w:p>
+    <w:p>
+      <w:pPr>
+        <w:jc w:val="both"/>
+      </w:pPr>
+      <w:r>
+        <w:t>What is covered here is the Phase 1 project design</w:t>
+      </w:r>
+      <w:r>
+        <w:t>: PL, Hardware, and Firmware</w:t>
+      </w:r>
+      <w:r>
+        <w:t>.  In doing so I will show performance and limitations thereof, things I got wrong, and issues in hardware, firmware, and PL I intend to correct, and or</w:t>
       </w:r>
       <w:r>
         <w:t>,</w:t>
       </w:r>
       <w:r>
-        <w:t xml:space="preserve"> a subset of needed peripherals </w:t>
-      </w:r>
-      <w:proofErr w:type="gramStart"/>
-      <w:r>
-        <w:t>are</w:t>
-      </w:r>
-      <w:proofErr w:type="gramEnd"/>
-      <w:r>
-        <w:t xml:space="preserve"> implemented which include: </w:t>
-      </w:r>
-      <w:r>
-        <w:t>UART</w:t>
-      </w:r>
-      <w:r>
-        <w:t xml:space="preserve">, </w:t>
-      </w:r>
-      <w:r>
-        <w:t xml:space="preserve">SPI, DDR, </w:t>
-      </w:r>
-      <w:r>
-        <w:t>T</w:t>
-      </w:r>
-      <w:r>
-        <w:t xml:space="preserve">imers, </w:t>
-      </w:r>
-      <w:proofErr w:type="spellStart"/>
-      <w:r>
-        <w:t>PWM</w:t>
-      </w:r>
-      <w:proofErr w:type="spellEnd"/>
-      <w:r>
-        <w:t xml:space="preserve">, </w:t>
-      </w:r>
-      <w:r>
-        <w:t xml:space="preserve">Interrupt Controller, </w:t>
-      </w:r>
-      <w:proofErr w:type="spellStart"/>
-      <w:r>
-        <w:t>FPU</w:t>
-      </w:r>
-      <w:proofErr w:type="spellEnd"/>
-      <w:r>
-        <w:t xml:space="preserve">, Cache memory </w:t>
-      </w:r>
-      <w:r>
-        <w:t>and other system services required to support a complete embedded application.</w:t>
-      </w:r>
-      <w:r>
-        <w:t xml:space="preserve">  </w:t>
-      </w:r>
-      <w:r>
-        <w:t xml:space="preserve">The resulting system demonstrates that the fundamental building blocks normally associated with a </w:t>
-      </w:r>
-      <w:r>
-        <w:t>µ</w:t>
-      </w:r>
-      <w:r>
-        <w:t xml:space="preserve">C </w:t>
-      </w:r>
-      <w:r>
-        <w:t xml:space="preserve">can be </w:t>
-      </w:r>
-      <w:r>
-        <w:t>tailored specifically to create the device need</w:t>
-      </w:r>
-      <w:r>
-        <w:t>ed</w:t>
-      </w:r>
-      <w:r>
-        <w:t xml:space="preserve">. </w:t>
-      </w:r>
-      <w:r>
-        <w:t xml:space="preserve">  That said, incorporated into </w:t>
-      </w:r>
-      <w:r>
-        <w:t xml:space="preserve">this first </w:t>
-      </w:r>
-      <w:r>
-        <w:t>phase</w:t>
-      </w:r>
-      <w:r>
-        <w:t xml:space="preserve"> </w:t>
-      </w:r>
-      <w:r>
-        <w:t xml:space="preserve">a </w:t>
-      </w:r>
-      <w:r>
-        <w:t xml:space="preserve">preview of what lies ahead through the inclusion of </w:t>
-      </w:r>
-      <w:r>
-        <w:t xml:space="preserve">two </w:t>
-      </w:r>
-      <w:r>
-        <w:t>custom RTL-based</w:t>
-      </w:r>
-      <w:r>
-        <w:t xml:space="preserve"> IP</w:t>
-      </w:r>
-      <w:r>
-        <w:t xml:space="preserve"> blocks</w:t>
-      </w:r>
-      <w:r>
-        <w:t xml:space="preserve"> (aka </w:t>
-      </w:r>
-      <w:r>
-        <w:t>m</w:t>
-      </w:r>
-      <w:r>
-        <w:t>odules)</w:t>
-      </w:r>
-      <w:r>
-        <w:t xml:space="preserve"> – </w:t>
-      </w:r>
-      <w:r>
-        <w:t xml:space="preserve">something </w:t>
-      </w:r>
-      <w:r>
-        <w:t xml:space="preserve">you cannot do within a </w:t>
-      </w:r>
-      <w:r>
-        <w:t>µ</w:t>
-      </w:r>
-      <w:r>
-        <w:t>C</w:t>
-      </w:r>
-      <w:r>
-        <w:t xml:space="preserve"> along with a few other FPGA differentiators.  </w:t>
+        <w:t xml:space="preserve"> address in Phase 2.</w:t>
       </w:r>
     </w:p>
     <w:p>
@@ -4052,46 +4082,7 @@
         <w:pStyle w:val="Heading2"/>
         <w:jc w:val="both"/>
       </w:pPr>
-      <w:bookmarkStart w:id="4" w:name="_Toc224704978"/>
-      <w:r>
-        <w:t>PHASE 1 / PHASE 2</w:t>
-      </w:r>
-      <w:r>
-        <w:t>:</w:t>
-      </w:r>
-      <w:bookmarkEnd w:id="4"/>
-    </w:p>
-    <w:p>
-      <w:pPr>
-        <w:jc w:val="both"/>
-      </w:pPr>
-      <w:r>
-        <w:t>What is covered here is the Phase 1 project design</w:t>
-      </w:r>
-      <w:r>
-        <w:t>: PL, Hardware, and Firmware</w:t>
-      </w:r>
-      <w:r>
-        <w:t>.  In doing so I will show performance and limitations thereof, things I got wrong, and issues in hardware, firmware, and PL I intend to correct, and or</w:t>
-      </w:r>
-      <w:r>
-        <w:t>,</w:t>
-      </w:r>
-      <w:r>
-        <w:t xml:space="preserve"> address in Phase 2.</w:t>
-      </w:r>
-    </w:p>
-    <w:p>
-      <w:pPr>
-        <w:jc w:val="both"/>
-      </w:pPr>
-    </w:p>
-    <w:p>
-      <w:pPr>
-        <w:pStyle w:val="Heading2"/>
-        <w:jc w:val="both"/>
-      </w:pPr>
-      <w:bookmarkStart w:id="5" w:name="_Toc224704979"/>
+      <w:bookmarkStart w:id="5" w:name="_Toc225065469"/>
       <w:proofErr w:type="gramStart"/>
       <w:r>
         <w:t>SO</w:t>
@@ -4404,7 +4395,7 @@
         <w:pStyle w:val="Heading1"/>
         <w:jc w:val="both"/>
       </w:pPr>
-      <w:bookmarkStart w:id="6" w:name="_Toc224704980"/>
+      <w:bookmarkStart w:id="6" w:name="_Toc225065470"/>
       <w:r>
         <w:lastRenderedPageBreak/>
         <w:t>AT A GLANCE</w:t>
@@ -4419,7 +4410,7 @@
         <w:pStyle w:val="Heading2"/>
         <w:jc w:val="both"/>
       </w:pPr>
-      <w:bookmarkStart w:id="7" w:name="_Toc224704981"/>
+      <w:bookmarkStart w:id="7" w:name="_Toc225065471"/>
       <w:r>
         <w:t xml:space="preserve">PL </w:t>
       </w:r>
@@ -4613,7 +4604,7 @@
         <w:pStyle w:val="Heading2"/>
         <w:jc w:val="both"/>
       </w:pPr>
-      <w:bookmarkStart w:id="8" w:name="_Toc224704982"/>
+      <w:bookmarkStart w:id="8" w:name="_Toc225065472"/>
       <w:proofErr w:type="spellStart"/>
       <w:r>
         <w:t>HW</w:t>
@@ -4792,7 +4783,7 @@
       <w:pPr>
         <w:pStyle w:val="Heading2"/>
       </w:pPr>
-      <w:bookmarkStart w:id="9" w:name="_Toc224704983"/>
+      <w:bookmarkStart w:id="9" w:name="_Toc225065473"/>
       <w:r>
         <w:t>FW FEATURES:</w:t>
       </w:r>
@@ -4876,7 +4867,7 @@
         <w:pStyle w:val="Heading2"/>
         <w:jc w:val="both"/>
       </w:pPr>
-      <w:bookmarkStart w:id="10" w:name="_Toc224704984"/>
+      <w:bookmarkStart w:id="10" w:name="_Toc225065474"/>
       <w:r>
         <w:lastRenderedPageBreak/>
         <w:t>SIMPLIFIED</w:t>
@@ -4895,7 +4886,7 @@
           <w:noProof/>
         </w:rPr>
         <w:drawing>
-          <wp:inline distT="0" distB="0" distL="0" distR="0" wp14:anchorId="6523967C" wp14:editId="7E4ECD36">
+          <wp:inline distT="0" distB="0" distL="0" distR="0" wp14:anchorId="6523967C" wp14:editId="0DC2FF78">
             <wp:extent cx="5936615" cy="3752850"/>
             <wp:effectExtent l="0" t="0" r="6985" b="0"/>
             <wp:docPr id="580303348" name="Picture 1"/>
@@ -4953,7 +4944,7 @@
       <w:pPr>
         <w:pStyle w:val="Heading1"/>
       </w:pPr>
-      <w:bookmarkStart w:id="11" w:name="_Toc224704985"/>
+      <w:bookmarkStart w:id="11" w:name="_Toc225065475"/>
       <w:r>
         <w:t xml:space="preserve">PROJECT </w:t>
       </w:r>
@@ -5021,7 +5012,7 @@
       <w:pPr>
         <w:pStyle w:val="Heading2"/>
       </w:pPr>
-      <w:bookmarkStart w:id="12" w:name="_Toc224704986"/>
+      <w:bookmarkStart w:id="12" w:name="_Toc225065476"/>
       <w:r>
         <w:t xml:space="preserve">P1 </w:t>
       </w:r>
@@ -5071,7 +5062,7 @@
       <w:pPr>
         <w:pStyle w:val="Heading2"/>
       </w:pPr>
-      <w:bookmarkStart w:id="13" w:name="_Toc224704987"/>
+      <w:bookmarkStart w:id="13" w:name="_Toc225065477"/>
       <w:r>
         <w:t xml:space="preserve">P1 </w:t>
       </w:r>
@@ -5190,7 +5181,7 @@
       <w:pPr>
         <w:pStyle w:val="Heading1"/>
       </w:pPr>
-      <w:bookmarkStart w:id="14" w:name="_Toc224704988"/>
+      <w:bookmarkStart w:id="14" w:name="_Toc225065478"/>
       <w:r>
         <w:lastRenderedPageBreak/>
         <w:t xml:space="preserve">DETAILED </w:t>
@@ -5235,7 +5226,7 @@
       <w:pPr>
         <w:pStyle w:val="Heading2"/>
       </w:pPr>
-      <w:bookmarkStart w:id="15" w:name="_Toc224704989"/>
+      <w:bookmarkStart w:id="15" w:name="_Toc225065479"/>
       <w:r>
         <w:t>AUDIO SA MODE DETAILS</w:t>
       </w:r>
@@ -5436,10 +5427,7 @@
         <w:t xml:space="preserve"> to limit the size here, with planned use of that memory in phase 2.</w:t>
       </w:r>
       <w:r>
-        <w:t xml:space="preserve">  </w:t>
-      </w:r>
-      <w:r>
-        <w:t>Additionally, six colored LEDs (arranged as a bar) display the magnitude (signal strength</w:t>
+        <w:t xml:space="preserve">  Additionally, six colored LEDs (arranged as a bar) display the magnitude (signal strength</w:t>
       </w:r>
       <w:r>
         <w:t xml:space="preserve"> no signal spectrum</w:t>
@@ -6475,10 +6463,7 @@
         <w:t>µ</w:t>
       </w:r>
       <w:r>
-        <w:t>C</w:t>
-      </w:r>
-      <w:r>
-        <w:t xml:space="preserve"> the application runs from FLASH.  This creates a more complex linker – the reader is encouraged to review the linker file (</w:t>
+        <w:t>C the application runs from FLASH.  This creates a more complex linker – the reader is encouraged to review the linker file (</w:t>
       </w:r>
       <w:proofErr w:type="spellStart"/>
       <w:proofErr w:type="gramStart"/>
@@ -6508,7 +6493,7 @@
       <w:pPr>
         <w:pStyle w:val="Heading2"/>
       </w:pPr>
-      <w:bookmarkStart w:id="16" w:name="_Toc224704990"/>
+      <w:bookmarkStart w:id="16" w:name="_Toc225065480"/>
       <w:r>
         <w:t>SIGNAL SA MODE DETAILS</w:t>
       </w:r>
@@ -7302,7 +7287,7 @@
       <w:pPr>
         <w:pStyle w:val="Heading1"/>
       </w:pPr>
-      <w:bookmarkStart w:id="17" w:name="_Toc224704991"/>
+      <w:bookmarkStart w:id="17" w:name="_Toc225065481"/>
       <w:r>
         <w:t>FFT IMPLEMENTATION AND NEED TO KNOW:</w:t>
       </w:r>
@@ -7312,7 +7297,7 @@
       <w:pPr>
         <w:pStyle w:val="Heading2"/>
       </w:pPr>
-      <w:bookmarkStart w:id="18" w:name="_Toc224704992"/>
+      <w:bookmarkStart w:id="18" w:name="_Toc225065482"/>
       <w:r>
         <w:t>FFT PROCESS FLOW:</w:t>
       </w:r>
@@ -7362,7 +7347,7 @@
       <w:pPr>
         <w:pStyle w:val="Heading2"/>
       </w:pPr>
-      <w:bookmarkStart w:id="19" w:name="_Toc224704993"/>
+      <w:bookmarkStart w:id="19" w:name="_Toc225065483"/>
       <w:r>
         <w:t>WHAT CAN BE MEASURED:</w:t>
       </w:r>
@@ -8399,7 +8384,7 @@
       <w:pPr>
         <w:pStyle w:val="Heading2"/>
       </w:pPr>
-      <w:bookmarkStart w:id="20" w:name="_Toc224704994"/>
+      <w:bookmarkStart w:id="20" w:name="_Toc225065484"/>
       <w:r>
         <w:t xml:space="preserve">SIZE </w:t>
       </w:r>
@@ -8585,7 +8570,7 @@
       <w:pPr>
         <w:pStyle w:val="Heading2"/>
       </w:pPr>
-      <w:bookmarkStart w:id="21" w:name="_Toc224704995"/>
+      <w:bookmarkStart w:id="21" w:name="_Toc225065485"/>
       <w:r>
         <w:t>WINDOW FUNCTION:</w:t>
       </w:r>
@@ -8852,37 +8837,7 @@
                             <w:rPr>
                               <w:rFonts w:ascii="Cambria Math" w:hAnsi="Cambria Math"/>
                             </w:rPr>
-                            <m:t>2π</m:t>
-                          </m:r>
-                          <m:r>
-                            <w:rPr>
-                              <w:rFonts w:ascii="Cambria Math" w:hAnsi="Cambria Math"/>
-                            </w:rPr>
-                            <m:t>(</m:t>
-                          </m:r>
-                          <m:r>
-                            <w:rPr>
-                              <w:rFonts w:ascii="Cambria Math" w:hAnsi="Cambria Math"/>
-                            </w:rPr>
-                            <m:t>Ind</m:t>
-                          </m:r>
-                          <m:r>
-                            <w:rPr>
-                              <w:rFonts w:ascii="Cambria Math" w:hAnsi="Cambria Math"/>
-                            </w:rPr>
-                            <m:t>e</m:t>
-                          </m:r>
-                          <m:r>
-                            <w:rPr>
-                              <w:rFonts w:ascii="Cambria Math" w:hAnsi="Cambria Math"/>
-                            </w:rPr>
-                            <m:t>x</m:t>
-                          </m:r>
-                          <m:r>
-                            <w:rPr>
-                              <w:rFonts w:ascii="Cambria Math" w:hAnsi="Cambria Math"/>
-                            </w:rPr>
-                            <m:t>)</m:t>
+                            <m:t>2π(Index)</m:t>
                           </m:r>
                         </m:num>
                         <m:den>
@@ -9160,7 +9115,7 @@
       <w:pPr>
         <w:pStyle w:val="Heading2"/>
       </w:pPr>
-      <w:bookmarkStart w:id="22" w:name="_Toc224704996"/>
+      <w:bookmarkStart w:id="22" w:name="_Toc225065486"/>
       <w:r>
         <w:t>SAMPLE JITTER – THE PHASE ERROR:</w:t>
       </w:r>
@@ -9311,7 +9266,7 @@
       <w:pPr>
         <w:pStyle w:val="Heading2"/>
       </w:pPr>
-      <w:bookmarkStart w:id="23" w:name="_Toc224704997"/>
+      <w:bookmarkStart w:id="23" w:name="_Toc225065487"/>
       <w:r>
         <w:t>HARMONICS:</w:t>
       </w:r>
@@ -9610,10 +9565,7 @@
         <w:t xml:space="preserve">  </w:t>
       </w:r>
       <w:r>
-        <w:t>See</w:t>
-      </w:r>
-      <w:r>
-        <w:t xml:space="preserve"> section </w:t>
+        <w:t xml:space="preserve">See section </w:t>
       </w:r>
       <w:hyperlink w:anchor="_LOCAL_OSCILLATOR_CLIPPING" w:history="1">
         <w:r>
@@ -10019,7 +9971,7 @@
       <w:pPr>
         <w:pStyle w:val="Heading1"/>
       </w:pPr>
-      <w:bookmarkStart w:id="24" w:name="_Toc224704998"/>
+      <w:bookmarkStart w:id="24" w:name="_Toc225065488"/>
       <w:r>
         <w:t>PHYSICAL CONTROLS:</w:t>
       </w:r>
@@ -10314,7 +10266,7 @@
       <w:pPr>
         <w:pStyle w:val="Heading1"/>
       </w:pPr>
-      <w:bookmarkStart w:id="25" w:name="_Toc224704999"/>
+      <w:bookmarkStart w:id="25" w:name="_Toc225065489"/>
       <w:r>
         <w:t>BOOT LOADER:</w:t>
       </w:r>
@@ -10331,7 +10283,13 @@
         <w:t>Every</w:t>
       </w:r>
       <w:r>
-        <w:t xml:space="preserve"> FPGA application requires a bootloader.  You cannot just program the FLASH.  </w:t>
+        <w:t xml:space="preserve"> FPGA application requires a bootloader.  You cannot </w:t>
+      </w:r>
+      <w:r>
+        <w:t>just OTP</w:t>
+      </w:r>
+      <w:r>
+        <w:t xml:space="preserve"> program the FLASH.  </w:t>
       </w:r>
       <w:r>
         <w:t xml:space="preserve">Unlike a </w:t>
@@ -10339,22 +10297,32 @@
       <w:r>
         <w:t>µ</w:t>
       </w:r>
-      <w:proofErr w:type="spellStart"/>
       <w:r>
         <w:t>C</w:t>
       </w:r>
       <w:r>
-        <w:t xml:space="preserve"> an</w:t>
-      </w:r>
-      <w:proofErr w:type="spellEnd"/>
-      <w:r>
-        <w:t xml:space="preserve"> FPGA program memory is not limited by the size of on chip FLASH, but rather the size of the external </w:t>
+        <w:t>,</w:t>
+      </w:r>
+      <w:r>
+        <w:t xml:space="preserve"> an FPGA program memory is not limited by the size of on chip FLASH, but rather the size of the external </w:t>
       </w:r>
       <w:r>
         <w:t xml:space="preserve">NV </w:t>
       </w:r>
       <w:r>
-        <w:t xml:space="preserve">memory.  </w:t>
+        <w:t>memory</w:t>
+      </w:r>
+      <w:r>
+        <w:t xml:space="preserve"> and</w:t>
+      </w:r>
+      <w:r>
+        <w:t xml:space="preserve"> DDR.  The external</w:t>
+      </w:r>
+      <w:r>
+        <w:t xml:space="preserve"> memory can be just about anything</w:t>
+      </w:r>
+      <w:r>
+        <w:t xml:space="preserve">.  </w:t>
       </w:r>
       <w:r>
         <w:t xml:space="preserve">For </w:t>
@@ -10390,43 +10358,61 @@
         <w:t>µSD</w:t>
       </w:r>
       <w:r>
+        <w:t xml:space="preserve"> providing</w:t>
+      </w:r>
+      <w:r>
+        <w:t xml:space="preserve"> the flexibility of changing the application just by changing the inserted </w:t>
+      </w:r>
+      <w:r>
+        <w:t>µSD card.</w:t>
+      </w:r>
+      <w:r>
+        <w:t xml:space="preserve">  </w:t>
+      </w:r>
+    </w:p>
+    <w:p>
+      <w:pPr>
+        <w:jc w:val="both"/>
+      </w:pPr>
+    </w:p>
+    <w:p>
+      <w:pPr>
+        <w:jc w:val="both"/>
+      </w:pPr>
+      <w:r>
+        <w:t>An FPGA can facilitate an exceptionally large application</w:t>
+      </w:r>
+      <w:r>
+        <w:t>;</w:t>
+      </w:r>
+      <w:r>
         <w:t xml:space="preserve"> </w:t>
       </w:r>
+      <w:r>
+        <w:t>the application size is not limited by the FPGA but by the external NV and attached DDR</w:t>
+      </w:r>
+      <w:r>
+        <w:t xml:space="preserve">.  </w:t>
+      </w:r>
+      <w:r>
+        <w:t xml:space="preserve">In the case of this </w:t>
+      </w:r>
       <w:proofErr w:type="gramStart"/>
       <w:r>
-        <w:t xml:space="preserve">providing </w:t>
-      </w:r>
-      <w:r>
-        <w:t xml:space="preserve"> the</w:t>
+        <w:t>hardware</w:t>
       </w:r>
       <w:proofErr w:type="gramEnd"/>
       <w:r>
-        <w:t xml:space="preserve"> flexibility of changing the application just by changing the inserted </w:t>
-      </w:r>
-      <w:r>
-        <w:t>µS</w:t>
-      </w:r>
-      <w:r>
-        <w:t>D card.</w:t>
-      </w:r>
-      <w:r>
-        <w:t xml:space="preserve">  </w:t>
-      </w:r>
-    </w:p>
-    <w:p>
-      <w:pPr>
-        <w:jc w:val="both"/>
-      </w:pPr>
-    </w:p>
-    <w:p>
-      <w:pPr>
-        <w:jc w:val="both"/>
-      </w:pPr>
-      <w:r>
-        <w:t xml:space="preserve">An FPGA can facilitate an exceptionally large application.  </w:t>
-      </w:r>
-      <w:r>
-        <w:t xml:space="preserve">This external FLASH though large, and can be larger still, holds far more than the application image.  </w:t>
+        <w:t xml:space="preserve"> it is possible to support a 128MB application</w:t>
+      </w:r>
+      <w:r>
+        <w:t xml:space="preserve"> (DDR limitation)</w:t>
+      </w:r>
+      <w:r>
+        <w:t xml:space="preserve">.  </w:t>
+      </w:r>
+      <w:r>
+        <w:t xml:space="preserve">This external FLASH though large, holds far more than the application image.  </w:t>
       </w:r>
       <w:r>
         <w:t>C</w:t>
@@ -10521,7 +10507,10 @@
         <w:t>MB_SSA_App</w:t>
       </w:r>
       <w:r>
-        <w:t>.elf</w:t>
+        <w:t>.</w:t>
+      </w:r>
+      <w:r>
+        <w:t>srec</w:t>
       </w:r>
       <w:proofErr w:type="spellEnd"/>
       <w:r>
@@ -10554,7 +10543,28 @@
       </w:r>
       <w:proofErr w:type="spellEnd"/>
       <w:r>
-        <w:t xml:space="preserve"> capabilities are loaded at POR hence the need for the </w:t>
+        <w:t xml:space="preserve"> capabilities </w:t>
+      </w:r>
+      <w:r>
+        <w:t xml:space="preserve">(PL) </w:t>
+      </w:r>
+      <w:r>
+        <w:t xml:space="preserve">are </w:t>
+      </w:r>
+      <w:r>
+        <w:t>completely</w:t>
+      </w:r>
+      <w:r>
+        <w:t xml:space="preserve"> flexible and </w:t>
+      </w:r>
+      <w:r>
+        <w:t>loaded at POR</w:t>
+      </w:r>
+      <w:r>
+        <w:t>,</w:t>
+      </w:r>
+      <w:r>
+        <w:t xml:space="preserve"> hence the need for the </w:t>
       </w:r>
       <w:proofErr w:type="spellStart"/>
       <w:r>
@@ -10594,7 +10604,13 @@
         <w:t xml:space="preserve">after PL configuration </w:t>
       </w:r>
       <w:r>
-        <w:t>the bootloader executes to load the DDR with the application image</w:t>
+        <w:t>the bootloader executes</w:t>
+      </w:r>
+      <w:r>
+        <w:t xml:space="preserve"> from LBM</w:t>
+      </w:r>
+      <w:r>
+        <w:t xml:space="preserve"> to load the DDR with the application image</w:t>
       </w:r>
       <w:r>
         <w:t xml:space="preserve"> and the Program counter loaded with the start of the application</w:t>
@@ -10645,28 +10661,44 @@
         <w:jc w:val="both"/>
       </w:pPr>
       <w:r>
+        <w:t xml:space="preserve">The bootloader and the application share the same PL.  A separate Quad SPI IP was added to support the external interface.  That additional interface is not used by the application.  Like with a </w:t>
+      </w:r>
+      <w:r>
+        <w:t>µ</w:t>
+      </w:r>
+      <w:r>
+        <w:t xml:space="preserve">C the bootloader is a separate application on to itself.  </w:t>
+      </w:r>
+    </w:p>
+    <w:p>
+      <w:pPr>
+        <w:jc w:val="both"/>
+      </w:pPr>
+    </w:p>
+    <w:p>
+      <w:pPr>
+        <w:jc w:val="both"/>
+      </w:pPr>
+      <w:r>
         <w:t xml:space="preserve">TBD phase 2 may instead use the </w:t>
       </w:r>
       <w:r>
         <w:t>µSD</w:t>
       </w:r>
       <w:r>
-        <w:t xml:space="preserve">.  The process is essentially the same, the difference being </w:t>
-      </w:r>
-      <w:r>
-        <w:t xml:space="preserve">the use of the FAT FS on the </w:t>
+        <w:t xml:space="preserve">.  The process is essentially the same, the difference being the use of the FAT FS on the </w:t>
       </w:r>
       <w:r>
         <w:t>µSD</w:t>
       </w:r>
       <w:r>
-        <w:t>.  Though more complex, requiring the FAT FS</w:t>
-      </w:r>
-      <w:r>
-        <w:t xml:space="preserve"> library and file manipulation.  T</w:t>
-      </w:r>
-      <w:r>
-        <w:t xml:space="preserve">he process is basically the same, just in three separate files: </w:t>
+        <w:t xml:space="preserve">.  Though </w:t>
+      </w:r>
+      <w:r>
+        <w:t xml:space="preserve">larger and </w:t>
+      </w:r>
+      <w:r>
+        <w:t xml:space="preserve">more complex, requiring the FAT FS library and file manipulation.  The process is basically the same, just in three separate files: </w:t>
       </w:r>
       <w:proofErr w:type="spellStart"/>
       <w:r>
@@ -10676,27 +10708,23 @@
       <w:r>
         <w:t xml:space="preserve">, bootloader image and application image.  </w:t>
       </w:r>
-    </w:p>
-    <w:p>
-      <w:pPr>
-        <w:jc w:val="both"/>
-      </w:pPr>
-    </w:p>
-    <w:p>
-      <w:pPr>
-        <w:jc w:val="both"/>
-      </w:pPr>
-      <w:r>
-        <w:t xml:space="preserve">The bootloader and the application share the same PL.  A separate Quad SPI IP was added to support the external interface.  That additional interface is not used by the application.  Like with a </w:t>
-      </w:r>
-      <w:r>
-        <w:t>µ</w:t>
-      </w:r>
-      <w:r>
-        <w:t>C</w:t>
-      </w:r>
-      <w:r>
-        <w:t xml:space="preserve"> the bootloader is a separate application on to itself.  </w:t>
+      <w:r>
+        <w:t>Additionally,</w:t>
+      </w:r>
+      <w:r>
+        <w:t xml:space="preserve"> this bootloader is very slow.  It takes about 2 minutes to load.  The application image is stored </w:t>
+      </w:r>
+      <w:r>
+        <w:lastRenderedPageBreak/>
+        <w:t>in flash as an .</w:t>
+      </w:r>
+      <w:proofErr w:type="spellStart"/>
+      <w:r>
+        <w:t>srec</w:t>
+      </w:r>
+      <w:proofErr w:type="spellEnd"/>
+      <w:r>
+        <w:t xml:space="preserve"> file and as such is parsed line by line creating a very slow load.  Perhaps for phase 2 I might consider the use of an elf file load – which should drop the boot time to seconds.  </w:t>
       </w:r>
     </w:p>
     <w:p>
@@ -10708,9 +10736,8 @@
       <w:pPr>
         <w:pStyle w:val="Heading1"/>
       </w:pPr>
-      <w:bookmarkStart w:id="26" w:name="_Toc224705000"/>
-      <w:r>
-        <w:lastRenderedPageBreak/>
+      <w:bookmarkStart w:id="26" w:name="_Toc225065490"/>
+      <w:r>
         <w:t>PHASE 2 LOOK AHEAD:</w:t>
       </w:r>
       <w:bookmarkEnd w:id="26"/>
@@ -10719,7 +10746,7 @@
       <w:pPr>
         <w:pStyle w:val="Heading2"/>
       </w:pPr>
-      <w:bookmarkStart w:id="27" w:name="_Toc224705001"/>
+      <w:bookmarkStart w:id="27" w:name="_Toc225065491"/>
       <w:r>
         <w:t>ENHANCEMENTS:</w:t>
       </w:r>
@@ -10940,7 +10967,7 @@
       <w:pPr>
         <w:pStyle w:val="Heading2"/>
       </w:pPr>
-      <w:bookmarkStart w:id="28" w:name="_Toc224705002"/>
+      <w:bookmarkStart w:id="28" w:name="_Toc225065492"/>
       <w:r>
         <w:t>CORRECTIONS:</w:t>
       </w:r>
@@ -11076,6 +11103,9 @@
       <w:r>
         <w:t xml:space="preserve">Anti-aliasing filter -3dB </w:t>
       </w:r>
+      <w:r>
+        <w:t xml:space="preserve">cut-off </w:t>
+      </w:r>
       <w:proofErr w:type="gramStart"/>
       <w:r>
         <w:t>adjusted</w:t>
@@ -11094,7 +11124,7 @@
       <w:pPr>
         <w:pStyle w:val="Heading1"/>
       </w:pPr>
-      <w:bookmarkStart w:id="29" w:name="_Toc224705003"/>
+      <w:bookmarkStart w:id="29" w:name="_Toc225065493"/>
       <w:r>
         <w:lastRenderedPageBreak/>
         <w:t>TECHNICAL SPECIFICATIONS:</w:t>
@@ -11105,7 +11135,7 @@
       <w:pPr>
         <w:pStyle w:val="Heading2"/>
       </w:pPr>
-      <w:bookmarkStart w:id="30" w:name="_Toc224705004"/>
+      <w:bookmarkStart w:id="30" w:name="_Toc225065494"/>
       <w:r>
         <w:t>ABSOLUTE MAXIMUM RATINGS</w:t>
       </w:r>
@@ -12357,7 +12387,7 @@
       <w:pPr>
         <w:pStyle w:val="Heading2"/>
       </w:pPr>
-      <w:bookmarkStart w:id="31" w:name="_Toc224705005"/>
+      <w:bookmarkStart w:id="31" w:name="_Toc225065495"/>
       <w:r>
         <w:t>OPERATIONAL RATINGS:</w:t>
       </w:r>
@@ -15739,7 +15769,7 @@
           <w:noProof/>
         </w:rPr>
       </w:pPr>
-      <w:bookmarkStart w:id="32" w:name="_Toc224705006"/>
+      <w:bookmarkStart w:id="32" w:name="_Toc225065496"/>
       <w:r>
         <w:rPr>
           <w:noProof/>
@@ -15759,7 +15789,7 @@
       <w:pPr>
         <w:pStyle w:val="Heading2"/>
       </w:pPr>
-      <w:bookmarkStart w:id="33" w:name="_Toc224705007"/>
+      <w:bookmarkStart w:id="33" w:name="_Toc225065497"/>
       <w:r>
         <w:t>IO EXPANDERS:</w:t>
       </w:r>
@@ -15999,7 +16029,7 @@
       <w:pPr>
         <w:pStyle w:val="Heading2"/>
       </w:pPr>
-      <w:bookmarkStart w:id="34" w:name="_Toc224705008"/>
+      <w:bookmarkStart w:id="34" w:name="_Toc225065498"/>
       <w:r>
         <w:lastRenderedPageBreak/>
         <w:t>DISPLAY (SSD1309 CHIP SET):</w:t>
@@ -16145,7 +16175,7 @@
       <w:pPr>
         <w:pStyle w:val="Heading2"/>
       </w:pPr>
-      <w:bookmarkStart w:id="35" w:name="_Toc224705009"/>
+      <w:bookmarkStart w:id="35" w:name="_Toc225065499"/>
       <w:proofErr w:type="spellStart"/>
       <w:r>
         <w:t>uSD</w:t>
@@ -16267,7 +16297,7 @@
       </w:pPr>
       <w:bookmarkStart w:id="36" w:name="_LOCAL_OSCILLATOR_CLIPPING"/>
       <w:bookmarkStart w:id="37" w:name="_ANTI-ALIASING_FILTER_DISCONTINUITY"/>
-      <w:bookmarkStart w:id="38" w:name="_Toc224705010"/>
+      <w:bookmarkStart w:id="38" w:name="_Toc225065500"/>
       <w:bookmarkEnd w:id="36"/>
       <w:bookmarkEnd w:id="37"/>
       <w:r>
@@ -16296,7 +16326,7 @@
       <w:pPr>
         <w:pStyle w:val="Heading1"/>
       </w:pPr>
-      <w:bookmarkStart w:id="39" w:name="_Toc224705011"/>
+      <w:bookmarkStart w:id="39" w:name="_Toc225065501"/>
       <w:r>
         <w:lastRenderedPageBreak/>
         <w:t>ACKNOWLEDGEMENT</w:t>
@@ -16605,39 +16635,92 @@
           <w:i/>
           <w:iCs/>
         </w:rPr>
-        <w:t>FRIEND:</w:t>
-      </w:r>
-    </w:p>
-    <w:p>
-      <w:pPr>
-        <w:jc w:val="both"/>
+        <w:t>FRIEND</w:t>
+      </w:r>
+      <w:r>
         <w:rPr>
           <w:i/>
           <w:iCs/>
         </w:rPr>
-      </w:pPr>
+        <w:t>S &amp; COLLEAGUES</w:t>
+      </w:r>
       <w:r>
         <w:rPr>
           <w:i/>
           <w:iCs/>
         </w:rPr>
-        <w:t xml:space="preserve">Special thanks to my friend Walter </w:t>
-      </w:r>
-      <w:proofErr w:type="gramStart"/>
-      <w:r>
+        <w:t>:</w:t>
+      </w:r>
+    </w:p>
+    <w:p>
+      <w:pPr>
+        <w:jc w:val="both"/>
         <w:rPr>
           <w:i/>
           <w:iCs/>
         </w:rPr>
-        <w:t>Varda</w:t>
-      </w:r>
-      <w:proofErr w:type="gramEnd"/>
+      </w:pPr>
       <w:r>
         <w:rPr>
           <w:i/>
           <w:iCs/>
         </w:rPr>
+        <w:t xml:space="preserve">Special thanks to my friend Walter </w:t>
+      </w:r>
+      <w:proofErr w:type="gramStart"/>
+      <w:r>
+        <w:rPr>
+          <w:i/>
+          <w:iCs/>
+        </w:rPr>
+        <w:t>Varda</w:t>
+      </w:r>
+      <w:proofErr w:type="gramEnd"/>
+      <w:r>
+        <w:rPr>
+          <w:i/>
+          <w:iCs/>
+        </w:rPr>
         <w:t xml:space="preserve"> an absolute Rock Star of analog engineering and an even better person.  </w:t>
+      </w:r>
+    </w:p>
+    <w:p>
+      <w:pPr>
+        <w:jc w:val="both"/>
+        <w:rPr>
+          <w:i/>
+          <w:iCs/>
+        </w:rPr>
+      </w:pPr>
+    </w:p>
+    <w:p>
+      <w:pPr>
+        <w:jc w:val="both"/>
+        <w:rPr>
+          <w:i/>
+          <w:iCs/>
+        </w:rPr>
+      </w:pPr>
+      <w:r>
+        <w:rPr>
+          <w:i/>
+          <w:iCs/>
+        </w:rPr>
+        <w:t xml:space="preserve">Special thanks to Timoth Brothers, Professor Electrical Engineering, GA Tech, a great sound board for crazy ideas and </w:t>
+      </w:r>
+      <w:r>
+        <w:rPr>
+          <w:i/>
+          <w:iCs/>
+        </w:rPr>
+        <w:t>limiting</w:t>
+      </w:r>
+      <w:r>
+        <w:rPr>
+          <w:i/>
+          <w:iCs/>
+        </w:rPr>
+        <w:t xml:space="preserve"> project scope.  Thank you for teaching and inspiring Trinity, we are forever grateful.  </w:t>
       </w:r>
     </w:p>
     <w:sectPr>
@@ -21713,6 +21796,7 @@
   <w:style w:type="character" w:default="1" w:styleId="DefaultParagraphFont">
     <w:name w:val="Default Paragraph Font"/>
     <w:uiPriority w:val="1"/>
+    <w:semiHidden/>
     <w:unhideWhenUsed/>
   </w:style>
   <w:style w:type="table" w:default="1" w:styleId="TableNormal">

</xml_diff>